<commit_message>
Soften Agility cover letter: outside-observer framing, reframe deployment bullet
Added "as an outside observer" before the five-point list so the confident
tone doesn't read as presumptuous critique. Replaced the deployment-gap
bullet (which implied their PR program had a hole) with a constructive
"start a customer story program" pitch using the same Toyota/GXO/Schaeffler
proof points, framed as an opportunity rather than a gap.

Co-Authored-By: Claude Sonnet 5 <noreply@anthropic.com>
Claude-Session: https://claude.ai/code/session_01HGwMf3WQEWpBH5LDYWi1id
</commit_message>
<xml_diff>
--- a/Taylor-Bornstein-Cover-Letter-Agility-Robotics.docx
+++ b/Taylor-Bornstein-Cover-Letter-Agility-Robotics.docx
@@ -95,7 +95,7 @@
           <w:sz w:val="22"/>
           <w:szCs w:val="22"/>
         </w:rPr>
-        <w:t xml:space="preserve">I spent an evening on agilityrobotics.com and in the SPAC filings. Five places I'd start:</w:t>
+        <w:t xml:space="preserve">I spent an evening on agilityrobotics.com and in the SPAC filings. As an outside observer, these are the five changes I'd go after first:</w:t>
       </w:r>
     </w:p>
     <w:p>
@@ -179,15 +179,15 @@
           <w:sz w:val="22"/>
           <w:szCs w:val="22"/>
         </w:rPr>
-        <w:t xml:space="preserve">Tell the deployment story you've already earned. </w:t>
-      </w:r>
-      <w:r>
-        <w:rPr>
-          <w:rFonts w:ascii="Noto Sans" w:cs="Noto Sans" w:eastAsia="Noto Sans" w:hAnsi="Noto Sans"/>
-          <w:sz w:val="22"/>
-          <w:szCs w:val="22"/>
-        </w:rPr>
-        <w:t xml:space="preserve">Digit is live at Toyota, GXO, Schaeffler, and Mercado Libre — real sites, real volume (GXO's Spanx facility alone has moved 100,000+ totes since mid-2024). That's rare proof for this category, and only one of those deployments has a published case study. Every unpublished site is a competitor's talking point sitting on your own floor.</w:t>
+        <w:t xml:space="preserve">Start a customer story program. </w:t>
+      </w:r>
+      <w:r>
+        <w:rPr>
+          <w:rFonts w:ascii="Noto Sans" w:cs="Noto Sans" w:eastAsia="Noto Sans" w:hAnsi="Noto Sans"/>
+          <w:sz w:val="22"/>
+          <w:szCs w:val="22"/>
+        </w:rPr>
+        <w:t xml:space="preserve">You already have the proof points: Toyota, GXO, Schaeffler, Mercado Libre — real sites, real volume (GXO's Spanx facility alone has moved 100,000+ totes since mid-2024). Turn them into full customer stories. It's the best decision-level content there is, and customer voices carry more weight with media than anything you say about yourselves.</w:t>
       </w:r>
     </w:p>
     <w:p>

</xml_diff>

<commit_message>
Tighten Agility cover letter intro
"And I do it well" as its own sentence lands harder than tacking it onto
the first. Cut "Here's where I'd start at Agility" (redundant with the
next paragraph) and simplified "agilityrobotics.com and in the SPAC
filings" to "the website."

Co-Authored-By: Claude Sonnet 5 <noreply@anthropic.com>
Claude-Session: https://claude.ai/code/session_01HGwMf3WQEWpBH5LDYWi1id
</commit_message>
<xml_diff>
--- a/Taylor-Bornstein-Cover-Letter-Agility-Robotics.docx
+++ b/Taylor-Bornstein-Cover-Letter-Agility-Robotics.docx
@@ -82,20 +82,20 @@
           <w:sz w:val="22"/>
           <w:szCs w:val="22"/>
         </w:rPr>
-        <w:t xml:space="preserve">Building excellent content practices from the ground up is what I do. I do it well. Here's where I'd start at Agility.</w:t>
-      </w:r>
-    </w:p>
-    <w:p>
-      <w:pPr>
-        <w:spacing w:after="200"/>
-      </w:pPr>
-      <w:r>
-        <w:rPr>
-          <w:rFonts w:ascii="Noto Sans" w:cs="Noto Sans" w:eastAsia="Noto Sans" w:hAnsi="Noto Sans"/>
-          <w:sz w:val="22"/>
-          <w:szCs w:val="22"/>
-        </w:rPr>
-        <w:t xml:space="preserve">I spent an evening on agilityrobotics.com and in the SPAC filings. As an outside observer, these are the five changes I'd go after first:</w:t>
+        <w:t xml:space="preserve">Building excellent content practices from the ground up is what I do. And I do it well.</w:t>
+      </w:r>
+    </w:p>
+    <w:p>
+      <w:pPr>
+        <w:spacing w:after="200"/>
+      </w:pPr>
+      <w:r>
+        <w:rPr>
+          <w:rFonts w:ascii="Noto Sans" w:cs="Noto Sans" w:eastAsia="Noto Sans" w:hAnsi="Noto Sans"/>
+          <w:sz w:val="22"/>
+          <w:szCs w:val="22"/>
+        </w:rPr>
+        <w:t xml:space="preserve">I spent an evening on the website. As an outside observer, these are the five changes I'd go after first:</w:t>
       </w:r>
     </w:p>
     <w:p>

</xml_diff>